<commit_message>
Explain reversal ordering and refusals precisely
- State the rule per module: a sale reversal can never be refused (goods come
  back in); a purchase reversal needs the stock still on hand; a production
  reversal needs its output still on hand.
- State the exact refusal message and that a refusal changes nothing.
- Document the reverse-order rule: undo the sale, then the production run, then
  the purchase, for an exact unwind; note that reversing a partly-consumed
  purchase is allowed but recalculates what is left.
- Fix the sample guide's refusal steps, which continued the previous list's
  numbering, and regenerate both docx files.

Co-authored-by: CommandCodeBot <noreply@commandcode.ai>
</commit_message>
<xml_diff>
--- a/PRODUCTION_MANUAL.docx
+++ b/PRODUCTION_MANUAL.docx
@@ -15501,7 +15501,7 @@
         <w:spacing w:after="40"/>
       </w:pPr>
       <w:r>
-        <w:t xml:space="preserve">Stock goes back at </w:t>
+        <w:t xml:space="preserve">Stock moves back at </w:t>
       </w:r>
       <w:r>
         <w:rPr>
@@ -15510,7 +15510,7 @@
         <w:t>exactly</w:t>
       </w:r>
       <w:r>
-        <w:t xml:space="preserve"> the value it left at, so the arithmetic unwinds</w:t>
+        <w:t xml:space="preserve"> the value it moved at, so the arithmetic unwinds</w:t>
       </w:r>
     </w:p>
     <w:p>
@@ -15533,11 +15533,429 @@
       </w:r>
     </w:p>
     <w:p>
-      <w:r>
-        <w:rPr>
-          <w:b/>
-        </w:rPr>
-        <w:t>When a reversal is refused:</w:t>
+      <w:pPr>
+        <w:pStyle w:val="Heading2"/>
+      </w:pPr>
+      <w:r>
+        <w:rPr>
+          <w:color w:val="0F172A"/>
+        </w:rPr>
+        <w:t>What each kind of reversal does to stock</w:t>
+      </w:r>
+    </w:p>
+    <w:p>
+      <w:r>
+        <w:t>A reversal puts back exactly what a transaction took, or takes back exactly what it put in. The only thing that can stop it is not having the stock to move:</w:t>
+      </w:r>
+    </w:p>
+    <w:tbl>
+      <w:tblPr>
+        <w:tblStyle w:val="TableGrid"/>
+        <w:tblW w:type="auto" w:w="0"/>
+        <w:jc w:val="left"/>
+        <w:tblLook w:firstColumn="1" w:firstRow="1" w:lastColumn="0" w:lastRow="0" w:noHBand="0" w:noVBand="1" w:val="04A0"/>
+      </w:tblPr>
+      <w:tblGrid>
+        <w:gridCol w:w="2880"/>
+        <w:gridCol w:w="2880"/>
+        <w:gridCol w:w="2880"/>
+      </w:tblGrid>
+      <w:tr>
+        <w:tc>
+          <w:tcPr>
+            <w:tcW w:type="dxa" w:w="2880"/>
+            <w:shd w:val="clear" w:color="auto" w:fill="F1F5F9"/>
+          </w:tcPr>
+          <w:p>
+            <w:r>
+              <w:rPr>
+                <w:b/>
+                <w:sz w:val="19"/>
+              </w:rPr>
+            </w:r>
+            <w:r>
+              <w:rPr>
+                <w:b/>
+                <w:sz w:val="19"/>
+              </w:rPr>
+              <w:t>Reversing a…</w:t>
+            </w:r>
+          </w:p>
+        </w:tc>
+        <w:tc>
+          <w:tcPr>
+            <w:tcW w:type="dxa" w:w="2880"/>
+            <w:shd w:val="clear" w:color="auto" w:fill="F1F5F9"/>
+          </w:tcPr>
+          <w:p>
+            <w:r>
+              <w:rPr>
+                <w:b/>
+                <w:sz w:val="19"/>
+              </w:rPr>
+            </w:r>
+            <w:r>
+              <w:rPr>
+                <w:b/>
+                <w:sz w:val="19"/>
+              </w:rPr>
+              <w:t>Stock moves</w:t>
+            </w:r>
+          </w:p>
+        </w:tc>
+        <w:tc>
+          <w:tcPr>
+            <w:tcW w:type="dxa" w:w="2880"/>
+            <w:shd w:val="clear" w:color="auto" w:fill="F1F5F9"/>
+          </w:tcPr>
+          <w:p>
+            <w:r>
+              <w:rPr>
+                <w:b/>
+                <w:sz w:val="19"/>
+              </w:rPr>
+            </w:r>
+            <w:r>
+              <w:rPr>
+                <w:b/>
+                <w:sz w:val="19"/>
+              </w:rPr>
+              <w:t>Can it be refused?</w:t>
+            </w:r>
+          </w:p>
+        </w:tc>
+      </w:tr>
+      <w:tr>
+        <w:tc>
+          <w:tcPr>
+            <w:tcW w:type="dxa" w:w="2880"/>
+          </w:tcPr>
+          <w:p>
+            <w:r>
+              <w:rPr>
+                <w:sz w:val="19"/>
+              </w:rPr>
+            </w:r>
+            <w:r>
+              <w:rPr>
+                <w:b/>
+                <w:sz w:val="19"/>
+              </w:rPr>
+              <w:t>Sale</w:t>
+            </w:r>
+          </w:p>
+        </w:tc>
+        <w:tc>
+          <w:tcPr>
+            <w:tcW w:type="dxa" w:w="2880"/>
+          </w:tcPr>
+          <w:p>
+            <w:r>
+              <w:rPr>
+                <w:sz w:val="19"/>
+              </w:rPr>
+            </w:r>
+            <w:r>
+              <w:rPr>
+                <w:sz w:val="19"/>
+              </w:rPr>
+              <w:t xml:space="preserve">goods come </w:t>
+            </w:r>
+            <w:r>
+              <w:rPr>
+                <w:b/>
+                <w:sz w:val="19"/>
+              </w:rPr>
+              <w:t>back in</w:t>
+            </w:r>
+          </w:p>
+        </w:tc>
+        <w:tc>
+          <w:tcPr>
+            <w:tcW w:type="dxa" w:w="2880"/>
+          </w:tcPr>
+          <w:p>
+            <w:r>
+              <w:rPr>
+                <w:sz w:val="19"/>
+              </w:rPr>
+            </w:r>
+            <w:r>
+              <w:rPr>
+                <w:b/>
+                <w:sz w:val="19"/>
+              </w:rPr>
+              <w:t>No.</w:t>
+            </w:r>
+            <w:r>
+              <w:rPr>
+                <w:sz w:val="19"/>
+              </w:rPr>
+              <w:t xml:space="preserve"> Putting goods back can never overdraw stock, so a sale can always be reversed.</w:t>
+            </w:r>
+          </w:p>
+        </w:tc>
+      </w:tr>
+      <w:tr>
+        <w:tc>
+          <w:tcPr>
+            <w:tcW w:type="dxa" w:w="2880"/>
+          </w:tcPr>
+          <w:p>
+            <w:r>
+              <w:rPr>
+                <w:sz w:val="19"/>
+              </w:rPr>
+            </w:r>
+            <w:r>
+              <w:rPr>
+                <w:b/>
+                <w:sz w:val="19"/>
+              </w:rPr>
+              <w:t>Purchase</w:t>
+            </w:r>
+          </w:p>
+        </w:tc>
+        <w:tc>
+          <w:tcPr>
+            <w:tcW w:type="dxa" w:w="2880"/>
+          </w:tcPr>
+          <w:p>
+            <w:r>
+              <w:rPr>
+                <w:sz w:val="19"/>
+              </w:rPr>
+            </w:r>
+            <w:r>
+              <w:rPr>
+                <w:sz w:val="19"/>
+              </w:rPr>
+              <w:t xml:space="preserve">goods go </w:t>
+            </w:r>
+            <w:r>
+              <w:rPr>
+                <w:b/>
+                <w:sz w:val="19"/>
+              </w:rPr>
+              <w:t>out</w:t>
+            </w:r>
+          </w:p>
+        </w:tc>
+        <w:tc>
+          <w:tcPr>
+            <w:tcW w:type="dxa" w:w="2880"/>
+          </w:tcPr>
+          <w:p>
+            <w:r>
+              <w:rPr>
+                <w:sz w:val="19"/>
+              </w:rPr>
+            </w:r>
+            <w:r>
+              <w:rPr>
+                <w:b/>
+                <w:sz w:val="19"/>
+              </w:rPr>
+              <w:t>Yes</w:t>
+            </w:r>
+            <w:r>
+              <w:rPr>
+                <w:sz w:val="19"/>
+              </w:rPr>
+              <w:t xml:space="preserve"> — only while you still hold at least as much of each item as the purchase delivered.</w:t>
+            </w:r>
+          </w:p>
+        </w:tc>
+      </w:tr>
+      <w:tr>
+        <w:tc>
+          <w:tcPr>
+            <w:tcW w:type="dxa" w:w="2880"/>
+          </w:tcPr>
+          <w:p>
+            <w:r>
+              <w:rPr>
+                <w:sz w:val="19"/>
+              </w:rPr>
+            </w:r>
+            <w:r>
+              <w:rPr>
+                <w:b/>
+                <w:sz w:val="19"/>
+              </w:rPr>
+              <w:t>Production run</w:t>
+            </w:r>
+          </w:p>
+        </w:tc>
+        <w:tc>
+          <w:tcPr>
+            <w:tcW w:type="dxa" w:w="2880"/>
+          </w:tcPr>
+          <w:p>
+            <w:r>
+              <w:rPr>
+                <w:sz w:val="19"/>
+              </w:rPr>
+            </w:r>
+            <w:r>
+              <w:rPr>
+                <w:sz w:val="19"/>
+              </w:rPr>
+              <w:t xml:space="preserve">the </w:t>
+            </w:r>
+            <w:r>
+              <w:rPr>
+                <w:b/>
+                <w:sz w:val="19"/>
+              </w:rPr>
+              <w:t>output goes out first</w:t>
+            </w:r>
+            <w:r>
+              <w:rPr>
+                <w:sz w:val="19"/>
+              </w:rPr>
+              <w:t>, then the components come back in</w:t>
+            </w:r>
+          </w:p>
+        </w:tc>
+        <w:tc>
+          <w:tcPr>
+            <w:tcW w:type="dxa" w:w="2880"/>
+          </w:tcPr>
+          <w:p>
+            <w:r>
+              <w:rPr>
+                <w:sz w:val="19"/>
+              </w:rPr>
+            </w:r>
+            <w:r>
+              <w:rPr>
+                <w:b/>
+                <w:sz w:val="19"/>
+              </w:rPr>
+              <w:t>Yes</w:t>
+            </w:r>
+            <w:r>
+              <w:rPr>
+                <w:sz w:val="19"/>
+              </w:rPr>
+              <w:t xml:space="preserve"> — only while the output is still on hand, i.e. none of what it made has been sold. Components always return freely.</w:t>
+            </w:r>
+          </w:p>
+        </w:tc>
+      </w:tr>
+      <w:tr>
+        <w:tc>
+          <w:tcPr>
+            <w:tcW w:type="dxa" w:w="2880"/>
+          </w:tcPr>
+          <w:p>
+            <w:r>
+              <w:rPr>
+                <w:sz w:val="19"/>
+              </w:rPr>
+            </w:r>
+            <w:r>
+              <w:rPr>
+                <w:b/>
+                <w:sz w:val="19"/>
+              </w:rPr>
+              <w:t>Payroll run</w:t>
+            </w:r>
+          </w:p>
+        </w:tc>
+        <w:tc>
+          <w:tcPr>
+            <w:tcW w:type="dxa" w:w="2880"/>
+          </w:tcPr>
+          <w:p>
+            <w:r>
+              <w:rPr>
+                <w:sz w:val="19"/>
+              </w:rPr>
+            </w:r>
+            <w:r>
+              <w:rPr>
+                <w:sz w:val="19"/>
+              </w:rPr>
+              <w:t>nothing (accounts only)</w:t>
+            </w:r>
+          </w:p>
+        </w:tc>
+        <w:tc>
+          <w:tcPr>
+            <w:tcW w:type="dxa" w:w="2880"/>
+          </w:tcPr>
+          <w:p>
+            <w:r>
+              <w:rPr>
+                <w:sz w:val="19"/>
+              </w:rPr>
+            </w:r>
+            <w:r>
+              <w:rPr>
+                <w:sz w:val="19"/>
+              </w:rPr>
+              <w:t>No.</w:t>
+            </w:r>
+          </w:p>
+        </w:tc>
+      </w:tr>
+    </w:tbl>
+    <w:p/>
+    <w:p>
+      <w:r>
+        <w:t>A refusal always names the item and the quantity on hand, for example *"Cannot take 30 of FG-100: only 20 on hand."* The whole reversal is one transaction, so a refusal changes nothing at all.</w:t>
+      </w:r>
+    </w:p>
+    <w:p>
+      <w:r>
+        <w:rPr>
+          <w:b/>
+        </w:rPr>
+        <w:t>"Already reversed"</w:t>
+      </w:r>
+      <w:r>
+        <w:t xml:space="preserve"> and </w:t>
+      </w:r>
+      <w:r>
+        <w:rPr>
+          <w:b/>
+        </w:rPr>
+        <w:t>"an approval is required"</w:t>
+      </w:r>
+      <w:r>
+        <w:t xml:space="preserve"> are the other two reasons a reversal is stopped (see 2.12 for approvals).</w:t>
+      </w:r>
+    </w:p>
+    <w:p>
+      <w:pPr>
+        <w:pStyle w:val="Heading2"/>
+      </w:pPr>
+      <w:r>
+        <w:rPr>
+          <w:color w:val="0F172A"/>
+        </w:rPr>
+        <w:t>The order to reverse in</w:t>
+      </w:r>
+    </w:p>
+    <w:p>
+      <w:r>
+        <w:t xml:space="preserve">Undo in the </w:t>
+      </w:r>
+      <w:r>
+        <w:rPr>
+          <w:b/>
+        </w:rPr>
+        <w:t>reverse order you did things</w:t>
+      </w:r>
+      <w:r>
+        <w:t xml:space="preserve"> — the sale first, then the production run, then the purchase. Reversing in that order is exact: stock quantity, stock value and average cost all return precisely to where they started.</w:t>
+      </w:r>
+    </w:p>
+    <w:p>
+      <w:r>
+        <w:t>The system allows a reversal whenever the stock permits it, but only unwinding in reverse order guarantees the figures land back exactly. Two things to know:</w:t>
       </w:r>
     </w:p>
     <w:p>
@@ -15546,16 +15964,18 @@
         <w:spacing w:after="40"/>
       </w:pPr>
       <w:r>
-        <w:t xml:space="preserve">The posting is </w:t>
-      </w:r>
-      <w:r>
-        <w:rPr>
-          <w:b/>
-        </w:rPr>
-        <w:t>already reversed</w:t>
-      </w:r>
-      <w:r>
-        <w:t>.</w:t>
+        <w:rPr>
+          <w:b/>
+        </w:rPr>
+        <w:t>A production run cannot be reversed while its output has been sold.</w:t>
+      </w:r>
+      <w:r>
+        <w:t xml:space="preserve"> Reverse</w:t>
+      </w:r>
+    </w:p>
+    <w:p>
+      <w:r>
+        <w:t>the sale that consumed the output first.</w:t>
       </w:r>
     </w:p>
     <w:p>
@@ -15564,39 +15984,22 @@
         <w:spacing w:after="40"/>
       </w:pPr>
       <w:r>
-        <w:t xml:space="preserve">The goods have since been </w:t>
-      </w:r>
-      <w:r>
-        <w:rPr>
-          <w:b/>
-        </w:rPr>
-        <w:t>used or sold</w:t>
-      </w:r>
-      <w:r>
-        <w:t>. For example, a purchase whose stock</w:t>
-      </w:r>
-    </w:p>
-    <w:p>
-      <w:r>
-        <w:t>has already been consumed in production cannot be taken back, because that would drive the quantity negative. The later transaction must be reversed first. The message names the item and what is on hand.</w:t>
-      </w:r>
-    </w:p>
-    <w:p>
-      <w:pPr>
-        <w:pStyle w:val="ListBullet"/>
-        <w:spacing w:after="40"/>
-      </w:pPr>
-      <w:r>
-        <w:t xml:space="preserve">An </w:t>
-      </w:r>
-      <w:r>
-        <w:rPr>
-          <w:b/>
-        </w:rPr>
-        <w:t>approval</w:t>
-      </w:r>
-      <w:r>
-        <w:t xml:space="preserve"> is required and has not been given (see 2.12).</w:t>
+        <w:t>**Reversing a purchase after some of it has been consumed is allowed if enough</w:t>
+      </w:r>
+    </w:p>
+    <w:p>
+      <w:r>
+        <w:t>remains, but it recalculates what is left.** The purchase is removed at exactly the value it came in at, so the remaining units take a new average. If you want the original figures back untouched, undo in reverse order instead.</w:t>
+      </w:r>
+    </w:p>
+    <w:p>
+      <w:pPr>
+        <w:spacing w:before="80" w:after="160"/>
+        <w:ind w:left="240"/>
+        <w:shd w:val="clear" w:color="auto" w:fill="F4F6F8"/>
+      </w:pPr>
+      <w:r>
+        <w:t>Reversals are recorded in the order you make them, however old the transaction they correct. The stock ledger lists rows in that order, so the running balance always reads correctly.</w:t>
       </w:r>
     </w:p>
     <w:p>

</xml_diff>

<commit_message>
Limit the Dashboard and Administration menus by role, and show Owner payroll
- Dashboard (Overview) is offered to Admin, Accountant and Owner only.
- The Administration group is offered to Admin and Owner only; an owner may read
  but not change any of it.
- Owner gains view access to payroll, so the Payroll menu appears for them.
- Security moves out of Administration into "My account", offered to everyone, so
  no role loses the ability to change its own password or set up 2FA.
- The menu is defined once in shared/nav.ts and used by the sidebar and by a new
  "Menus by role" table on Roles & Access, so the two cannot drift.
- A role that cannot see the Dashboard now lands on the first screen it can open,
  instead of being redirected to a page it may not read.
- Manuals and their docx updated; frontend tests cover the new menu rules.

Co-authored-by: CommandCodeBot <noreply@commandcode.ai>
</commit_message>
<xml_diff>
--- a/PRODUCTION_MANUAL.docx
+++ b/PRODUCTION_MANUAL.docx
@@ -1518,7 +1518,7 @@
               <w:rPr>
                 <w:sz w:val="19"/>
               </w:rPr>
-              <w:t>The permission table, a live permission test, and (for Admin) user accounts and the audit log.</w:t>
+              <w:t>The permission table, who sees which menus, a live permission test, and (for Admin) user accounts and the audit log.</w:t>
             </w:r>
           </w:p>
         </w:tc>
@@ -1616,7 +1616,7 @@
                 <w:b/>
                 <w:sz w:val="19"/>
               </w:rPr>
-              <w:t>Security</w:t>
+              <w:t>Configuration</w:t>
             </w:r>
           </w:p>
         </w:tc>
@@ -1634,7 +1634,7 @@
               <w:rPr>
                 <w:sz w:val="19"/>
               </w:rPr>
-              <w:t>Your own password and two-factor settings.</w:t>
+              <w:t>Every rate, company detail and control switch, editable without a programmer.</w:t>
             </w:r>
           </w:p>
         </w:tc>
@@ -1674,7 +1674,7 @@
                 <w:b/>
                 <w:sz w:val="19"/>
               </w:rPr>
-              <w:t>Configuration</w:t>
+              <w:t>Data</w:t>
             </w:r>
           </w:p>
         </w:tc>
@@ -1692,7 +1692,7 @@
               <w:rPr>
                 <w:sz w:val="19"/>
               </w:rPr>
-              <w:t>Every rate, company detail and control switch, editable without a programmer.</w:t>
+              <w:t>Import a workbook, or start the books over. Admin only.</w:t>
             </w:r>
           </w:p>
         </w:tc>
@@ -1713,7 +1713,7 @@
                 <w:b/>
                 <w:sz w:val="19"/>
               </w:rPr>
-              <w:t>Administration</w:t>
+              <w:t>My account</w:t>
             </w:r>
           </w:p>
         </w:tc>
@@ -1732,7 +1732,7 @@
                 <w:b/>
                 <w:sz w:val="19"/>
               </w:rPr>
-              <w:t>Data</w:t>
+              <w:t>Security</w:t>
             </w:r>
           </w:p>
         </w:tc>
@@ -1750,7 +1750,7 @@
               <w:rPr>
                 <w:sz w:val="19"/>
               </w:rPr>
-              <w:t>Import a workbook, or start the books over. Admin only.</w:t>
+              <w:t>Your own password and two-factor settings.</w:t>
             </w:r>
           </w:p>
         </w:tc>
@@ -1759,8 +1759,47 @@
     <w:p/>
     <w:p>
       <w:r>
-        <w:t xml:space="preserve">The five </w:t>
-      </w:r>
+        <w:t xml:space="preserve">The </w:t>
+      </w:r>
+      <w:r>
+        <w:rPr>
+          <w:b/>
+        </w:rPr>
+        <w:t>Operations</w:t>
+      </w:r>
+      <w:r>
+        <w:t xml:space="preserve"> group is the one everybody works in; the others are narrower. Three groups are limited by </w:t>
+      </w:r>
+      <w:r>
+        <w:rPr>
+          <w:b/>
+        </w:rPr>
+        <w:t>who you are</w:t>
+      </w:r>
+      <w:r>
+        <w:t xml:space="preserve"> rather than by an area permission:</w:t>
+      </w:r>
+    </w:p>
+    <w:p>
+      <w:pPr>
+        <w:pStyle w:val="ListBullet"/>
+        <w:spacing w:after="40"/>
+      </w:pPr>
+      <w:r>
+        <w:rPr>
+          <w:b/>
+        </w:rPr>
+        <w:t>Overview</w:t>
+      </w:r>
+      <w:r>
+        <w:t xml:space="preserve"> (the Dashboard) — Admin, Accountant and Owner only.</w:t>
+      </w:r>
+    </w:p>
+    <w:p>
+      <w:pPr>
+        <w:pStyle w:val="ListBullet"/>
+        <w:spacing w:after="40"/>
+      </w:pPr>
       <w:r>
         <w:rPr>
           <w:b/>
@@ -1768,25 +1807,27 @@
         <w:t>Administration</w:t>
       </w:r>
       <w:r>
-        <w:t xml:space="preserve"> items are available to anyone signed in, except </w:t>
-      </w:r>
-      <w:r>
-        <w:rPr>
-          <w:b/>
-        </w:rPr>
-        <w:t>Data</w:t>
-      </w:r>
-      <w:r>
-        <w:t xml:space="preserve">, whose controls only work for an </w:t>
-      </w:r>
-      <w:r>
-        <w:rPr>
-          <w:b/>
-        </w:rPr>
-        <w:t>Admin</w:t>
-      </w:r>
-      <w:r>
-        <w:t>.</w:t>
+        <w:t xml:space="preserve"> — Admin and Owner only; an owner may look but not change.</w:t>
+      </w:r>
+    </w:p>
+    <w:p>
+      <w:pPr>
+        <w:pStyle w:val="ListBullet"/>
+        <w:spacing w:after="40"/>
+      </w:pPr>
+      <w:r>
+        <w:rPr>
+          <w:b/>
+        </w:rPr>
+        <w:t>My account</w:t>
+      </w:r>
+      <w:r>
+        <w:t xml:space="preserve"> — everybody, so anyone can change their own password.</w:t>
+      </w:r>
+    </w:p>
+    <w:p>
+      <w:r>
+        <w:t>See "Which menus each role is offered" in 1.2 for the full grid.</w:t>
       </w:r>
     </w:p>
     <w:p>
@@ -2307,6 +2348,1057 @@
       </w:tr>
     </w:tbl>
     <w:p/>
+    <w:p>
+      <w:pPr>
+        <w:pStyle w:val="Heading2"/>
+      </w:pPr>
+      <w:r>
+        <w:rPr>
+          <w:color w:val="0F172A"/>
+        </w:rPr>
+        <w:t>Which menus each role is offered</w:t>
+      </w:r>
+    </w:p>
+    <w:p>
+      <w:r>
+        <w:t>The sidebar only shows a group when the role may open something inside it.</w:t>
+      </w:r>
+    </w:p>
+    <w:tbl>
+      <w:tblPr>
+        <w:tblStyle w:val="TableGrid"/>
+        <w:tblW w:type="auto" w:w="0"/>
+        <w:jc w:val="left"/>
+        <w:tblLook w:firstColumn="1" w:firstRow="1" w:lastColumn="0" w:lastRow="0" w:noHBand="0" w:noVBand="1" w:val="04A0"/>
+      </w:tblPr>
+      <w:tblGrid>
+        <w:gridCol w:w="1440"/>
+        <w:gridCol w:w="1440"/>
+        <w:gridCol w:w="1440"/>
+        <w:gridCol w:w="1440"/>
+        <w:gridCol w:w="1440"/>
+        <w:gridCol w:w="1440"/>
+      </w:tblGrid>
+      <w:tr>
+        <w:tc>
+          <w:tcPr>
+            <w:tcW w:type="dxa" w:w="1440"/>
+            <w:shd w:val="clear" w:color="auto" w:fill="F1F5F9"/>
+          </w:tcPr>
+          <w:p>
+            <w:r>
+              <w:rPr>
+                <w:b/>
+                <w:sz w:val="19"/>
+              </w:rPr>
+            </w:r>
+            <w:r>
+              <w:rPr>
+                <w:b/>
+                <w:sz w:val="19"/>
+              </w:rPr>
+              <w:t>Menu group</w:t>
+            </w:r>
+          </w:p>
+        </w:tc>
+        <w:tc>
+          <w:tcPr>
+            <w:tcW w:type="dxa" w:w="1440"/>
+            <w:shd w:val="clear" w:color="auto" w:fill="F1F5F9"/>
+          </w:tcPr>
+          <w:p>
+            <w:r>
+              <w:rPr>
+                <w:b/>
+                <w:sz w:val="19"/>
+              </w:rPr>
+            </w:r>
+            <w:r>
+              <w:rPr>
+                <w:b/>
+                <w:sz w:val="19"/>
+              </w:rPr>
+              <w:t>Admin</w:t>
+            </w:r>
+          </w:p>
+        </w:tc>
+        <w:tc>
+          <w:tcPr>
+            <w:tcW w:type="dxa" w:w="1440"/>
+            <w:shd w:val="clear" w:color="auto" w:fill="F1F5F9"/>
+          </w:tcPr>
+          <w:p>
+            <w:r>
+              <w:rPr>
+                <w:b/>
+                <w:sz w:val="19"/>
+              </w:rPr>
+            </w:r>
+            <w:r>
+              <w:rPr>
+                <w:b/>
+                <w:sz w:val="19"/>
+              </w:rPr>
+              <w:t>Accountant</w:t>
+            </w:r>
+          </w:p>
+        </w:tc>
+        <w:tc>
+          <w:tcPr>
+            <w:tcW w:type="dxa" w:w="1440"/>
+            <w:shd w:val="clear" w:color="auto" w:fill="F1F5F9"/>
+          </w:tcPr>
+          <w:p>
+            <w:r>
+              <w:rPr>
+                <w:b/>
+                <w:sz w:val="19"/>
+              </w:rPr>
+            </w:r>
+            <w:r>
+              <w:rPr>
+                <w:b/>
+                <w:sz w:val="19"/>
+              </w:rPr>
+              <w:t>Store / Production</w:t>
+            </w:r>
+          </w:p>
+        </w:tc>
+        <w:tc>
+          <w:tcPr>
+            <w:tcW w:type="dxa" w:w="1440"/>
+            <w:shd w:val="clear" w:color="auto" w:fill="F1F5F9"/>
+          </w:tcPr>
+          <w:p>
+            <w:r>
+              <w:rPr>
+                <w:b/>
+                <w:sz w:val="19"/>
+              </w:rPr>
+            </w:r>
+            <w:r>
+              <w:rPr>
+                <w:b/>
+                <w:sz w:val="19"/>
+              </w:rPr>
+              <w:t>Sales Staff</w:t>
+            </w:r>
+          </w:p>
+        </w:tc>
+        <w:tc>
+          <w:tcPr>
+            <w:tcW w:type="dxa" w:w="1440"/>
+            <w:shd w:val="clear" w:color="auto" w:fill="F1F5F9"/>
+          </w:tcPr>
+          <w:p>
+            <w:r>
+              <w:rPr>
+                <w:b/>
+                <w:sz w:val="19"/>
+              </w:rPr>
+            </w:r>
+            <w:r>
+              <w:rPr>
+                <w:b/>
+                <w:sz w:val="19"/>
+              </w:rPr>
+              <w:t>Owner / Viewer</w:t>
+            </w:r>
+          </w:p>
+        </w:tc>
+      </w:tr>
+      <w:tr>
+        <w:tc>
+          <w:tcPr>
+            <w:tcW w:type="dxa" w:w="1440"/>
+          </w:tcPr>
+          <w:p>
+            <w:r>
+              <w:rPr>
+                <w:sz w:val="19"/>
+              </w:rPr>
+            </w:r>
+            <w:r>
+              <w:rPr>
+                <w:b/>
+                <w:sz w:val="19"/>
+              </w:rPr>
+              <w:t>Overview</w:t>
+            </w:r>
+            <w:r>
+              <w:rPr>
+                <w:sz w:val="19"/>
+              </w:rPr>
+              <w:t xml:space="preserve"> — Dashboard</w:t>
+            </w:r>
+          </w:p>
+        </w:tc>
+        <w:tc>
+          <w:tcPr>
+            <w:tcW w:type="dxa" w:w="1440"/>
+          </w:tcPr>
+          <w:p>
+            <w:r>
+              <w:rPr>
+                <w:sz w:val="19"/>
+              </w:rPr>
+            </w:r>
+            <w:r>
+              <w:rPr>
+                <w:sz w:val="19"/>
+              </w:rPr>
+              <w:t>Yes</w:t>
+            </w:r>
+          </w:p>
+        </w:tc>
+        <w:tc>
+          <w:tcPr>
+            <w:tcW w:type="dxa" w:w="1440"/>
+          </w:tcPr>
+          <w:p>
+            <w:r>
+              <w:rPr>
+                <w:sz w:val="19"/>
+              </w:rPr>
+            </w:r>
+            <w:r>
+              <w:rPr>
+                <w:sz w:val="19"/>
+              </w:rPr>
+              <w:t>Yes</w:t>
+            </w:r>
+          </w:p>
+        </w:tc>
+        <w:tc>
+          <w:tcPr>
+            <w:tcW w:type="dxa" w:w="1440"/>
+          </w:tcPr>
+          <w:p>
+            <w:r>
+              <w:rPr>
+                <w:sz w:val="19"/>
+              </w:rPr>
+            </w:r>
+            <w:r>
+              <w:rPr>
+                <w:sz w:val="19"/>
+              </w:rPr>
+              <w:t>—</w:t>
+            </w:r>
+          </w:p>
+        </w:tc>
+        <w:tc>
+          <w:tcPr>
+            <w:tcW w:type="dxa" w:w="1440"/>
+          </w:tcPr>
+          <w:p>
+            <w:r>
+              <w:rPr>
+                <w:sz w:val="19"/>
+              </w:rPr>
+            </w:r>
+            <w:r>
+              <w:rPr>
+                <w:sz w:val="19"/>
+              </w:rPr>
+              <w:t>—</w:t>
+            </w:r>
+          </w:p>
+        </w:tc>
+        <w:tc>
+          <w:tcPr>
+            <w:tcW w:type="dxa" w:w="1440"/>
+          </w:tcPr>
+          <w:p>
+            <w:r>
+              <w:rPr>
+                <w:sz w:val="19"/>
+              </w:rPr>
+            </w:r>
+            <w:r>
+              <w:rPr>
+                <w:sz w:val="19"/>
+              </w:rPr>
+              <w:t>Yes</w:t>
+            </w:r>
+          </w:p>
+        </w:tc>
+      </w:tr>
+      <w:tr>
+        <w:tc>
+          <w:tcPr>
+            <w:tcW w:type="dxa" w:w="1440"/>
+          </w:tcPr>
+          <w:p>
+            <w:r>
+              <w:rPr>
+                <w:sz w:val="19"/>
+              </w:rPr>
+            </w:r>
+            <w:r>
+              <w:rPr>
+                <w:b/>
+                <w:sz w:val="19"/>
+              </w:rPr>
+              <w:t>Ledger</w:t>
+            </w:r>
+            <w:r>
+              <w:rPr>
+                <w:sz w:val="19"/>
+              </w:rPr>
+              <w:t xml:space="preserve"> — accounts, journal</w:t>
+            </w:r>
+          </w:p>
+        </w:tc>
+        <w:tc>
+          <w:tcPr>
+            <w:tcW w:type="dxa" w:w="1440"/>
+          </w:tcPr>
+          <w:p>
+            <w:r>
+              <w:rPr>
+                <w:sz w:val="19"/>
+              </w:rPr>
+            </w:r>
+            <w:r>
+              <w:rPr>
+                <w:sz w:val="19"/>
+              </w:rPr>
+              <w:t>Yes</w:t>
+            </w:r>
+          </w:p>
+        </w:tc>
+        <w:tc>
+          <w:tcPr>
+            <w:tcW w:type="dxa" w:w="1440"/>
+          </w:tcPr>
+          <w:p>
+            <w:r>
+              <w:rPr>
+                <w:sz w:val="19"/>
+              </w:rPr>
+            </w:r>
+            <w:r>
+              <w:rPr>
+                <w:sz w:val="19"/>
+              </w:rPr>
+              <w:t>Yes</w:t>
+            </w:r>
+          </w:p>
+        </w:tc>
+        <w:tc>
+          <w:tcPr>
+            <w:tcW w:type="dxa" w:w="1440"/>
+          </w:tcPr>
+          <w:p>
+            <w:r>
+              <w:rPr>
+                <w:sz w:val="19"/>
+              </w:rPr>
+            </w:r>
+            <w:r>
+              <w:rPr>
+                <w:sz w:val="19"/>
+              </w:rPr>
+              <w:t>—</w:t>
+            </w:r>
+          </w:p>
+        </w:tc>
+        <w:tc>
+          <w:tcPr>
+            <w:tcW w:type="dxa" w:w="1440"/>
+          </w:tcPr>
+          <w:p>
+            <w:r>
+              <w:rPr>
+                <w:sz w:val="19"/>
+              </w:rPr>
+            </w:r>
+            <w:r>
+              <w:rPr>
+                <w:sz w:val="19"/>
+              </w:rPr>
+              <w:t>—</w:t>
+            </w:r>
+          </w:p>
+        </w:tc>
+        <w:tc>
+          <w:tcPr>
+            <w:tcW w:type="dxa" w:w="1440"/>
+          </w:tcPr>
+          <w:p>
+            <w:r>
+              <w:rPr>
+                <w:sz w:val="19"/>
+              </w:rPr>
+            </w:r>
+            <w:r>
+              <w:rPr>
+                <w:sz w:val="19"/>
+              </w:rPr>
+              <w:t>Yes</w:t>
+            </w:r>
+          </w:p>
+        </w:tc>
+      </w:tr>
+      <w:tr>
+        <w:tc>
+          <w:tcPr>
+            <w:tcW w:type="dxa" w:w="1440"/>
+          </w:tcPr>
+          <w:p>
+            <w:r>
+              <w:rPr>
+                <w:sz w:val="19"/>
+              </w:rPr>
+            </w:r>
+            <w:r>
+              <w:rPr>
+                <w:b/>
+                <w:sz w:val="19"/>
+              </w:rPr>
+              <w:t>Operations</w:t>
+            </w:r>
+            <w:r>
+              <w:rPr>
+                <w:sz w:val="19"/>
+              </w:rPr>
+              <w:t xml:space="preserve"> — stock, buying, making, selling</w:t>
+            </w:r>
+          </w:p>
+        </w:tc>
+        <w:tc>
+          <w:tcPr>
+            <w:tcW w:type="dxa" w:w="1440"/>
+          </w:tcPr>
+          <w:p>
+            <w:r>
+              <w:rPr>
+                <w:sz w:val="19"/>
+              </w:rPr>
+            </w:r>
+            <w:r>
+              <w:rPr>
+                <w:sz w:val="19"/>
+              </w:rPr>
+              <w:t>Yes</w:t>
+            </w:r>
+          </w:p>
+        </w:tc>
+        <w:tc>
+          <w:tcPr>
+            <w:tcW w:type="dxa" w:w="1440"/>
+          </w:tcPr>
+          <w:p>
+            <w:r>
+              <w:rPr>
+                <w:sz w:val="19"/>
+              </w:rPr>
+            </w:r>
+            <w:r>
+              <w:rPr>
+                <w:sz w:val="19"/>
+              </w:rPr>
+              <w:t>Yes (read only)</w:t>
+            </w:r>
+          </w:p>
+        </w:tc>
+        <w:tc>
+          <w:tcPr>
+            <w:tcW w:type="dxa" w:w="1440"/>
+          </w:tcPr>
+          <w:p>
+            <w:r>
+              <w:rPr>
+                <w:sz w:val="19"/>
+              </w:rPr>
+            </w:r>
+            <w:r>
+              <w:rPr>
+                <w:sz w:val="19"/>
+              </w:rPr>
+              <w:t>Yes</w:t>
+            </w:r>
+          </w:p>
+        </w:tc>
+        <w:tc>
+          <w:tcPr>
+            <w:tcW w:type="dxa" w:w="1440"/>
+          </w:tcPr>
+          <w:p>
+            <w:r>
+              <w:rPr>
+                <w:sz w:val="19"/>
+              </w:rPr>
+            </w:r>
+            <w:r>
+              <w:rPr>
+                <w:sz w:val="19"/>
+              </w:rPr>
+              <w:t>Yes</w:t>
+            </w:r>
+          </w:p>
+        </w:tc>
+        <w:tc>
+          <w:tcPr>
+            <w:tcW w:type="dxa" w:w="1440"/>
+          </w:tcPr>
+          <w:p>
+            <w:r>
+              <w:rPr>
+                <w:sz w:val="19"/>
+              </w:rPr>
+            </w:r>
+            <w:r>
+              <w:rPr>
+                <w:sz w:val="19"/>
+              </w:rPr>
+              <w:t>Yes (read only)</w:t>
+            </w:r>
+          </w:p>
+        </w:tc>
+      </w:tr>
+      <w:tr>
+        <w:tc>
+          <w:tcPr>
+            <w:tcW w:type="dxa" w:w="1440"/>
+          </w:tcPr>
+          <w:p>
+            <w:r>
+              <w:rPr>
+                <w:sz w:val="19"/>
+              </w:rPr>
+            </w:r>
+            <w:r>
+              <w:rPr>
+                <w:b/>
+                <w:sz w:val="19"/>
+              </w:rPr>
+              <w:t>Payroll</w:t>
+            </w:r>
+            <w:r>
+              <w:rPr>
+                <w:sz w:val="19"/>
+              </w:rPr>
+              <w:t xml:space="preserve"> — employees, runs</w:t>
+            </w:r>
+          </w:p>
+        </w:tc>
+        <w:tc>
+          <w:tcPr>
+            <w:tcW w:type="dxa" w:w="1440"/>
+          </w:tcPr>
+          <w:p>
+            <w:r>
+              <w:rPr>
+                <w:sz w:val="19"/>
+              </w:rPr>
+            </w:r>
+            <w:r>
+              <w:rPr>
+                <w:sz w:val="19"/>
+              </w:rPr>
+              <w:t>Yes</w:t>
+            </w:r>
+          </w:p>
+        </w:tc>
+        <w:tc>
+          <w:tcPr>
+            <w:tcW w:type="dxa" w:w="1440"/>
+          </w:tcPr>
+          <w:p>
+            <w:r>
+              <w:rPr>
+                <w:sz w:val="19"/>
+              </w:rPr>
+            </w:r>
+            <w:r>
+              <w:rPr>
+                <w:sz w:val="19"/>
+              </w:rPr>
+              <w:t>Yes</w:t>
+            </w:r>
+          </w:p>
+        </w:tc>
+        <w:tc>
+          <w:tcPr>
+            <w:tcW w:type="dxa" w:w="1440"/>
+          </w:tcPr>
+          <w:p>
+            <w:r>
+              <w:rPr>
+                <w:sz w:val="19"/>
+              </w:rPr>
+            </w:r>
+            <w:r>
+              <w:rPr>
+                <w:sz w:val="19"/>
+              </w:rPr>
+              <w:t>—</w:t>
+            </w:r>
+          </w:p>
+        </w:tc>
+        <w:tc>
+          <w:tcPr>
+            <w:tcW w:type="dxa" w:w="1440"/>
+          </w:tcPr>
+          <w:p>
+            <w:r>
+              <w:rPr>
+                <w:sz w:val="19"/>
+              </w:rPr>
+            </w:r>
+            <w:r>
+              <w:rPr>
+                <w:sz w:val="19"/>
+              </w:rPr>
+              <w:t>—</w:t>
+            </w:r>
+          </w:p>
+        </w:tc>
+        <w:tc>
+          <w:tcPr>
+            <w:tcW w:type="dxa" w:w="1440"/>
+          </w:tcPr>
+          <w:p>
+            <w:r>
+              <w:rPr>
+                <w:sz w:val="19"/>
+              </w:rPr>
+            </w:r>
+            <w:r>
+              <w:rPr>
+                <w:sz w:val="19"/>
+              </w:rPr>
+              <w:t>Yes (read only)</w:t>
+            </w:r>
+          </w:p>
+        </w:tc>
+      </w:tr>
+      <w:tr>
+        <w:tc>
+          <w:tcPr>
+            <w:tcW w:type="dxa" w:w="1440"/>
+          </w:tcPr>
+          <w:p>
+            <w:r>
+              <w:rPr>
+                <w:sz w:val="19"/>
+              </w:rPr>
+            </w:r>
+            <w:r>
+              <w:rPr>
+                <w:b/>
+                <w:sz w:val="19"/>
+              </w:rPr>
+              <w:t>Reports</w:t>
+            </w:r>
+            <w:r>
+              <w:rPr>
+                <w:sz w:val="19"/>
+              </w:rPr>
+              <w:t xml:space="preserve"> — trial balance, ledger, balance sheet</w:t>
+            </w:r>
+          </w:p>
+        </w:tc>
+        <w:tc>
+          <w:tcPr>
+            <w:tcW w:type="dxa" w:w="1440"/>
+          </w:tcPr>
+          <w:p>
+            <w:r>
+              <w:rPr>
+                <w:sz w:val="19"/>
+              </w:rPr>
+            </w:r>
+            <w:r>
+              <w:rPr>
+                <w:sz w:val="19"/>
+              </w:rPr>
+              <w:t>Yes</w:t>
+            </w:r>
+          </w:p>
+        </w:tc>
+        <w:tc>
+          <w:tcPr>
+            <w:tcW w:type="dxa" w:w="1440"/>
+          </w:tcPr>
+          <w:p>
+            <w:r>
+              <w:rPr>
+                <w:sz w:val="19"/>
+              </w:rPr>
+            </w:r>
+            <w:r>
+              <w:rPr>
+                <w:sz w:val="19"/>
+              </w:rPr>
+              <w:t>Yes</w:t>
+            </w:r>
+          </w:p>
+        </w:tc>
+        <w:tc>
+          <w:tcPr>
+            <w:tcW w:type="dxa" w:w="1440"/>
+          </w:tcPr>
+          <w:p>
+            <w:r>
+              <w:rPr>
+                <w:sz w:val="19"/>
+              </w:rPr>
+            </w:r>
+            <w:r>
+              <w:rPr>
+                <w:sz w:val="19"/>
+              </w:rPr>
+              <w:t>Yes</w:t>
+            </w:r>
+          </w:p>
+        </w:tc>
+        <w:tc>
+          <w:tcPr>
+            <w:tcW w:type="dxa" w:w="1440"/>
+          </w:tcPr>
+          <w:p>
+            <w:r>
+              <w:rPr>
+                <w:sz w:val="19"/>
+              </w:rPr>
+            </w:r>
+            <w:r>
+              <w:rPr>
+                <w:sz w:val="19"/>
+              </w:rPr>
+              <w:t>Yes</w:t>
+            </w:r>
+          </w:p>
+        </w:tc>
+        <w:tc>
+          <w:tcPr>
+            <w:tcW w:type="dxa" w:w="1440"/>
+          </w:tcPr>
+          <w:p>
+            <w:r>
+              <w:rPr>
+                <w:sz w:val="19"/>
+              </w:rPr>
+            </w:r>
+            <w:r>
+              <w:rPr>
+                <w:sz w:val="19"/>
+              </w:rPr>
+              <w:t>Yes</w:t>
+            </w:r>
+          </w:p>
+        </w:tc>
+      </w:tr>
+      <w:tr>
+        <w:tc>
+          <w:tcPr>
+            <w:tcW w:type="dxa" w:w="1440"/>
+          </w:tcPr>
+          <w:p>
+            <w:r>
+              <w:rPr>
+                <w:sz w:val="19"/>
+              </w:rPr>
+            </w:r>
+            <w:r>
+              <w:rPr>
+                <w:b/>
+                <w:sz w:val="19"/>
+              </w:rPr>
+              <w:t>Administration</w:t>
+            </w:r>
+            <w:r>
+              <w:rPr>
+                <w:sz w:val="19"/>
+              </w:rPr>
+              <w:t xml:space="preserve"> — roles, approvals, configuration, data</w:t>
+            </w:r>
+          </w:p>
+        </w:tc>
+        <w:tc>
+          <w:tcPr>
+            <w:tcW w:type="dxa" w:w="1440"/>
+          </w:tcPr>
+          <w:p>
+            <w:r>
+              <w:rPr>
+                <w:sz w:val="19"/>
+              </w:rPr>
+            </w:r>
+            <w:r>
+              <w:rPr>
+                <w:sz w:val="19"/>
+              </w:rPr>
+              <w:t>Yes</w:t>
+            </w:r>
+          </w:p>
+        </w:tc>
+        <w:tc>
+          <w:tcPr>
+            <w:tcW w:type="dxa" w:w="1440"/>
+          </w:tcPr>
+          <w:p>
+            <w:r>
+              <w:rPr>
+                <w:sz w:val="19"/>
+              </w:rPr>
+            </w:r>
+            <w:r>
+              <w:rPr>
+                <w:sz w:val="19"/>
+              </w:rPr>
+              <w:t>—</w:t>
+            </w:r>
+          </w:p>
+        </w:tc>
+        <w:tc>
+          <w:tcPr>
+            <w:tcW w:type="dxa" w:w="1440"/>
+          </w:tcPr>
+          <w:p>
+            <w:r>
+              <w:rPr>
+                <w:sz w:val="19"/>
+              </w:rPr>
+            </w:r>
+            <w:r>
+              <w:rPr>
+                <w:sz w:val="19"/>
+              </w:rPr>
+              <w:t>—</w:t>
+            </w:r>
+          </w:p>
+        </w:tc>
+        <w:tc>
+          <w:tcPr>
+            <w:tcW w:type="dxa" w:w="1440"/>
+          </w:tcPr>
+          <w:p>
+            <w:r>
+              <w:rPr>
+                <w:sz w:val="19"/>
+              </w:rPr>
+            </w:r>
+            <w:r>
+              <w:rPr>
+                <w:sz w:val="19"/>
+              </w:rPr>
+              <w:t>—</w:t>
+            </w:r>
+          </w:p>
+        </w:tc>
+        <w:tc>
+          <w:tcPr>
+            <w:tcW w:type="dxa" w:w="1440"/>
+          </w:tcPr>
+          <w:p>
+            <w:r>
+              <w:rPr>
+                <w:sz w:val="19"/>
+              </w:rPr>
+            </w:r>
+            <w:r>
+              <w:rPr>
+                <w:sz w:val="19"/>
+              </w:rPr>
+              <w:t>Yes (read only)</w:t>
+            </w:r>
+          </w:p>
+        </w:tc>
+      </w:tr>
+      <w:tr>
+        <w:tc>
+          <w:tcPr>
+            <w:tcW w:type="dxa" w:w="1440"/>
+          </w:tcPr>
+          <w:p>
+            <w:r>
+              <w:rPr>
+                <w:sz w:val="19"/>
+              </w:rPr>
+            </w:r>
+            <w:r>
+              <w:rPr>
+                <w:b/>
+                <w:sz w:val="19"/>
+              </w:rPr>
+              <w:t>My account</w:t>
+            </w:r>
+            <w:r>
+              <w:rPr>
+                <w:sz w:val="19"/>
+              </w:rPr>
+              <w:t xml:space="preserve"> — your password and 2-FA</w:t>
+            </w:r>
+          </w:p>
+        </w:tc>
+        <w:tc>
+          <w:tcPr>
+            <w:tcW w:type="dxa" w:w="1440"/>
+          </w:tcPr>
+          <w:p>
+            <w:r>
+              <w:rPr>
+                <w:sz w:val="19"/>
+              </w:rPr>
+            </w:r>
+            <w:r>
+              <w:rPr>
+                <w:sz w:val="19"/>
+              </w:rPr>
+              <w:t>Yes</w:t>
+            </w:r>
+          </w:p>
+        </w:tc>
+        <w:tc>
+          <w:tcPr>
+            <w:tcW w:type="dxa" w:w="1440"/>
+          </w:tcPr>
+          <w:p>
+            <w:r>
+              <w:rPr>
+                <w:sz w:val="19"/>
+              </w:rPr>
+            </w:r>
+            <w:r>
+              <w:rPr>
+                <w:sz w:val="19"/>
+              </w:rPr>
+              <w:t>Yes</w:t>
+            </w:r>
+          </w:p>
+        </w:tc>
+        <w:tc>
+          <w:tcPr>
+            <w:tcW w:type="dxa" w:w="1440"/>
+          </w:tcPr>
+          <w:p>
+            <w:r>
+              <w:rPr>
+                <w:sz w:val="19"/>
+              </w:rPr>
+            </w:r>
+            <w:r>
+              <w:rPr>
+                <w:sz w:val="19"/>
+              </w:rPr>
+              <w:t>Yes</w:t>
+            </w:r>
+          </w:p>
+        </w:tc>
+        <w:tc>
+          <w:tcPr>
+            <w:tcW w:type="dxa" w:w="1440"/>
+          </w:tcPr>
+          <w:p>
+            <w:r>
+              <w:rPr>
+                <w:sz w:val="19"/>
+              </w:rPr>
+            </w:r>
+            <w:r>
+              <w:rPr>
+                <w:sz w:val="19"/>
+              </w:rPr>
+              <w:t>Yes</w:t>
+            </w:r>
+          </w:p>
+        </w:tc>
+        <w:tc>
+          <w:tcPr>
+            <w:tcW w:type="dxa" w:w="1440"/>
+          </w:tcPr>
+          <w:p>
+            <w:r>
+              <w:rPr>
+                <w:sz w:val="19"/>
+              </w:rPr>
+            </w:r>
+            <w:r>
+              <w:rPr>
+                <w:sz w:val="19"/>
+              </w:rPr>
+              <w:t>Yes</w:t>
+            </w:r>
+          </w:p>
+        </w:tc>
+      </w:tr>
+    </w:tbl>
+    <w:p/>
+    <w:p>
+      <w:r>
+        <w:t xml:space="preserve">Two of these are limited by </w:t>
+      </w:r>
+      <w:r>
+        <w:rPr>
+          <w:b/>
+        </w:rPr>
+        <w:t>who you are</w:t>
+      </w:r>
+      <w:r>
+        <w:t>, not by an area permission:</w:t>
+      </w:r>
+    </w:p>
+    <w:p>
+      <w:pPr>
+        <w:pStyle w:val="ListBullet"/>
+        <w:spacing w:after="40"/>
+      </w:pPr>
+      <w:r>
+        <w:t xml:space="preserve">The </w:t>
+      </w:r>
+      <w:r>
+        <w:rPr>
+          <w:b/>
+        </w:rPr>
+        <w:t>Dashboard</w:t>
+      </w:r>
+      <w:r>
+        <w:t xml:space="preserve"> sums up the whole business, so it is offered to Admin,</w:t>
+      </w:r>
+    </w:p>
+    <w:p>
+      <w:r>
+        <w:t>Accountant and Owner only.</w:t>
+      </w:r>
+    </w:p>
+    <w:p>
+      <w:pPr>
+        <w:pStyle w:val="ListBullet"/>
+        <w:spacing w:after="40"/>
+      </w:pPr>
+      <w:r>
+        <w:t xml:space="preserve">The </w:t>
+      </w:r>
+      <w:r>
+        <w:rPr>
+          <w:b/>
+        </w:rPr>
+        <w:t>Administration</w:t>
+      </w:r>
+      <w:r>
+        <w:t xml:space="preserve"> group is offered to Admin and Owner only. Inside it, an</w:t>
+      </w:r>
+    </w:p>
+    <w:p>
+      <w:r>
+        <w:t>owner can look but not change: saving a setting, issuing a password, disabling an account, importing or resetting data all remain administrator-only.</w:t>
+      </w:r>
+    </w:p>
+    <w:p>
+      <w:r>
+        <w:rPr>
+          <w:b/>
+        </w:rPr>
+        <w:t>Every role keeps "My account"</w:t>
+      </w:r>
+      <w:r>
+        <w:t>, so anyone can change their own password and set up two-factor sign-in without asking an administrator.</w:t>
+      </w:r>
+    </w:p>
     <w:p>
       <w:pPr>
         <w:pStyle w:val="Heading2"/>

</xml_diff>

<commit_message>
Give Store and Sales only their own work, and a hamburger menu on mobile
- Store/Production and Sales lose the Reports area: they see the screens their job
  needs and nothing else. Store gets Inventory & BOM and Production Entry; Sales
  gets Purchase Entry and Sales Entry, plus a read-only look at items.
- Each role now lands on its own working screen after signing in (Store on
  Inventory, Sales on Sales Entry) rather than the first item in the menu.
- On a screen narrower than 900px the sidebar becomes a drawer behind a menu
  button: it slides in over the page, closes when an item is chosen, when the
  backdrop is tapped, or on Escape.
- Tests: menu rules per role, landing per role, and a render test of the drawer.
- Manuals and docx updated.

Co-authored-by: CommandCodeBot <noreply@commandcode.ai>
</commit_message>
<xml_diff>
--- a/PRODUCTION_MANUAL.docx
+++ b/PRODUCTION_MANUAL.docx
@@ -1828,6 +1828,26 @@
     <w:p>
       <w:r>
         <w:t>See "Which menus each role is offered" in 1.2 for the full grid.</w:t>
+      </w:r>
+    </w:p>
+    <w:p>
+      <w:r>
+        <w:rPr>
+          <w:b/>
+        </w:rPr>
+        <w:t>On a narrow screen</w:t>
+      </w:r>
+      <w:r>
+        <w:t xml:space="preserve"> — a phone or a small tablet — the menu folds away behind a </w:t>
+      </w:r>
+      <w:r>
+        <w:rPr>
+          <w:b/>
+        </w:rPr>
+        <w:t>menu button</w:t>
+      </w:r>
+      <w:r>
+        <w:t xml:space="preserve"> at the top left. Tap it to slide the menu out; tap an item to open that screen; tap anywhere outside the menu, or press Escape, to close it. Nothing is lost: the same items are there, and Store and Sales users see only the work they do.</w:t>
       </w:r>
     </w:p>
     <w:p>
@@ -2191,7 +2211,7 @@
               <w:rPr>
                 <w:sz w:val="19"/>
               </w:rPr>
-              <w:t>Reports</w:t>
+              <w:t>Nothing else</w:t>
             </w:r>
           </w:p>
         </w:tc>
@@ -2266,7 +2286,7 @@
               <w:rPr>
                 <w:sz w:val="19"/>
               </w:rPr>
-              <w:t>Items, reports</w:t>
+              <w:t>Items</w:t>
             </w:r>
           </w:p>
         </w:tc>
@@ -3051,7 +3071,7 @@
               <w:rPr>
                 <w:sz w:val="19"/>
               </w:rPr>
-              <w:t>Yes</w:t>
+              <w:t>—</w:t>
             </w:r>
           </w:p>
         </w:tc>
@@ -3069,7 +3089,7 @@
               <w:rPr>
                 <w:sz w:val="19"/>
               </w:rPr>
-              <w:t>Yes</w:t>
+              <w:t>—</w:t>
             </w:r>
           </w:p>
         </w:tc>
@@ -3386,6 +3406,53 @@
     <w:p>
       <w:r>
         <w:t>owner can look but not change: saving a setting, issuing a password, disabling an account, importing or resetting data all remain administrator-only.</w:t>
+      </w:r>
+    </w:p>
+    <w:p>
+      <w:r>
+        <w:rPr>
+          <w:b/>
+        </w:rPr>
+        <w:t>Store/Production and Sales see only the work they do.</w:t>
+      </w:r>
+      <w:r>
+        <w:t xml:space="preserve"> Store staff get </w:t>
+      </w:r>
+      <w:r>
+        <w:rPr>
+          <w:b/>
+        </w:rPr>
+        <w:t>Inventory &amp; BOM</w:t>
+      </w:r>
+      <w:r>
+        <w:t xml:space="preserve"> and </w:t>
+      </w:r>
+      <w:r>
+        <w:rPr>
+          <w:b/>
+        </w:rPr>
+        <w:t>Production Entry</w:t>
+      </w:r>
+      <w:r>
+        <w:t xml:space="preserve">; sales staff get </w:t>
+      </w:r>
+      <w:r>
+        <w:rPr>
+          <w:b/>
+        </w:rPr>
+        <w:t>Purchase Entry</w:t>
+      </w:r>
+      <w:r>
+        <w:t xml:space="preserve"> and </w:t>
+      </w:r>
+      <w:r>
+        <w:rPr>
+          <w:b/>
+        </w:rPr>
+        <w:t>Sales Entry</w:t>
+      </w:r>
+      <w:r>
+        <w:t>, plus a read-only look at items so they can pick what they are selling. Neither is offered the Dashboard, the ledger, payroll or the financial reports — only the screens their own job needs.</w:t>
       </w:r>
     </w:p>
     <w:p>

</xml_diff>

<commit_message>
Refuse a purchase reversal once the item has moved
Reversing a purchase removes the goods at exactly the value they came in at. If
the item has been sold, consumed or topped up since, subtracting that old value
leaves what remains valued at a figure that never existed:

  hold 100 kg at 20, buy 100 kg at 25 -> 200 kg at 22.50
  consume 60 kg -> 140 kg at 22.50
  reverse the purchase -> 40 kg at 16.25, though those 40 kg cost 20

The item is now refused until the later transactions are reversed, which puts it
back where the purchase left it; the reversal is then exact. The message names the
item and both quantities.

- New StockMovedError (409), and movement_for() to compare an item's position now
  with the position it held just after the purchase
- Imported history, which has no such ledger row, keeps the quantity guard
- Manuals and sample guide updated with the example and the new order to reverse in

Co-authored-by: CommandCodeBot <noreply@commandcode.ai>
</commit_message>
<xml_diff>
--- a/PRODUCTION_MANUAL.docx
+++ b/PRODUCTION_MANUAL.docx
@@ -16921,7 +16921,7 @@
               <w:rPr>
                 <w:sz w:val="19"/>
               </w:rPr>
-              <w:t xml:space="preserve"> — only while you still hold at least as much of each item as the purchase delivered.</w:t>
+              <w:t xml:space="preserve"> — only while nothing has touched the item since the purchase.</w:t>
             </w:r>
           </w:p>
         </w:tc>
@@ -17064,7 +17064,7 @@
     <w:p/>
     <w:p>
       <w:r>
-        <w:t>A refusal always names the item and the quantity on hand, for example *"Cannot take 30 of FG-100: only 20 on hand."* The whole reversal is one transaction, so a refusal changes nothing at all.</w:t>
+        <w:t>A refusal always names the item and what is on hand, for example *"Cannot take 30 of FG-100: only 20 on hand."* The whole reversal is one transaction, so a refusal changes nothing at all.</w:t>
       </w:r>
     </w:p>
     <w:p>
@@ -17110,11 +17110,6 @@
       </w:r>
       <w:r>
         <w:t xml:space="preserve"> — the sale first, then the production run, then the purchase. Reversing in that order is exact: stock quantity, stock value and average cost all return precisely to where they started.</w:t>
-      </w:r>
-    </w:p>
-    <w:p>
-      <w:r>
-        <w:t>The system allows a reversal whenever the stock permits it, but only unwinding in reverse order guarantees the figures land back exactly. Two things to know:</w:t>
       </w:r>
     </w:p>
     <w:p>
@@ -17143,12 +17138,20 @@
         <w:spacing w:after="40"/>
       </w:pPr>
       <w:r>
-        <w:t>**Reversing a purchase after some of it has been consumed is allowed if enough</w:t>
-      </w:r>
-    </w:p>
-    <w:p>
-      <w:r>
-        <w:t>remains, but it recalculates what is left.** The purchase is removed at exactly the value it came in at, so the remaining units take a new average. If you want the original figures back untouched, undo in reverse order instead.</w:t>
+        <w:rPr>
+          <w:b/>
+        </w:rPr>
+        <w:t>A purchase cannot be reversed while anything has touched the item since.</w:t>
+      </w:r>
+    </w:p>
+    <w:p>
+      <w:r>
+        <w:t>Sold, consumed, or even topped up with another purchase — any of those changes the item's average, and taking the original purchase back out at its own value would leave what remains valued at a figure that never existed.</w:t>
+      </w:r>
+    </w:p>
+    <w:p>
+      <w:r>
+        <w:t>The refusal names the item and both quantities, for example: *"RMC-100 has moved since this purchase (200.0000 on hand then, 140.0000 now). Reverse the later transactions first."* Do that, and the purchase reversal becomes exact — the item returns to exactly where it started.</w:t>
       </w:r>
     </w:p>
     <w:p>
@@ -17159,6 +17162,70 @@
       </w:pPr>
       <w:r>
         <w:t>Reversals are recorded in the order you make them, however old the transaction they correct. The stock ledger lists rows in that order, so the running balance always reads correctly.</w:t>
+      </w:r>
+    </w:p>
+    <w:p>
+      <w:pPr>
+        <w:pStyle w:val="Heading2"/>
+      </w:pPr>
+      <w:r>
+        <w:rPr>
+          <w:color w:val="0F172A"/>
+        </w:rPr>
+        <w:t>Why a purchase is refused rather than recalculated</w:t>
+      </w:r>
+    </w:p>
+    <w:p>
+      <w:r>
+        <w:t xml:space="preserve">Suppose you hold 100 kg at 20 each, then buy 100 kg at 25. You now hold 200 kg worth 4,500 — an average of </w:t>
+      </w:r>
+      <w:r>
+        <w:rPr>
+          <w:b/>
+        </w:rPr>
+        <w:t>22.50</w:t>
+      </w:r>
+      <w:r>
+        <w:t>. You use 60 kg in production, leaving 140 kg worth 3,150, the average still 22.50.</w:t>
+      </w:r>
+    </w:p>
+    <w:p>
+      <w:r>
+        <w:t xml:space="preserve">Reverse the purchase now, and it removes 100 kg at the 2,500 it came in at. What is left is 40 kg worth </w:t>
+      </w:r>
+      <w:r>
+        <w:rPr>
+          <w:rFonts w:ascii="Consolas" w:hAnsi="Consolas"/>
+          <w:color w:val="1D4ED8"/>
+          <w:sz w:val="19"/>
+        </w:rPr>
+        <w:t>3,150 − 2,500 = 650</w:t>
+      </w:r>
+      <w:r>
+        <w:t xml:space="preserve"> — </w:t>
+      </w:r>
+      <w:r>
+        <w:rPr>
+          <w:b/>
+        </w:rPr>
+        <w:t>16.25 each</w:t>
+      </w:r>
+      <w:r>
+        <w:t xml:space="preserve">. But those 40 kg are the original stock that cost </w:t>
+      </w:r>
+      <w:r>
+        <w:rPr>
+          <w:b/>
+        </w:rPr>
+        <w:t>20</w:t>
+      </w:r>
+      <w:r>
+        <w:t>. The stock sheet and the accounts would still agree with each other, yet the item would be carried at a price that never existed, and every later cost drawn from it would be wrong.</w:t>
+      </w:r>
+    </w:p>
+    <w:p>
+      <w:r>
+        <w:t>So the system refuses, and asks you to reverse the production run first. Undoing the run puts the 60 kg back, the item returns to 200 kg at 22.50, and the purchase then comes out exactly.</w:t>
       </w:r>
     </w:p>
     <w:p>

</xml_diff>

<commit_message>
Show posting times on journal entries, and record resignations
- Journal Entries: each voucher now shows when it was entered, with the time,
  beside who entered it.
- Employees: the staff list gains Joining date and Mobile columns.
- Resigning is now recorded rather than left implicit. An employee has a leaving
  date, and the form carries a Status switch: choose Resigned, and the leaving
  date defaults to today. Payroll stops including them; the runs that already
  paid them still name them; switching back to Active clears the leaving date, so
  re-employing somebody does not carry the old resignation with them.
- Manuals updated.

Co-authored-by: CommandCodeBot <noreply@commandcode.ai>
</commit_message>
<xml_diff>
--- a/PRODUCTION_MANUAL.docx
+++ b/PRODUCTION_MANUAL.docx
@@ -5967,7 +5967,16 @@
         <w:t>Purchase</w:t>
       </w:r>
       <w:r>
-        <w:t>.</w:t>
+        <w:t xml:space="preserve">. Each card also gives the number of lines, who entered it, and </w:t>
+      </w:r>
+      <w:r>
+        <w:rPr>
+          <w:b/>
+        </w:rPr>
+        <w:t>when — date and time</w:t>
+      </w:r>
+      <w:r>
+        <w:t xml:space="preserve"> — so a voucher can be matched to the moment it was posted.</w:t>
       </w:r>
     </w:p>
     <w:p>
@@ -7144,6 +7153,15 @@
         <w:t>Gross salary</w:t>
       </w:r>
       <w:r>
+        <w:t xml:space="preserve">, and </w:t>
+      </w:r>
+      <w:r>
+        <w:rPr>
+          <w:b/>
+        </w:rPr>
+        <w:t>Status</w:t>
+      </w:r>
+      <w:r>
         <w:t>.</w:t>
       </w:r>
     </w:p>
@@ -7159,16 +7177,50 @@
         <w:t>Staff</w:t>
       </w:r>
       <w:r>
-        <w:t xml:space="preserve"> table: </w:t>
-      </w:r>
-      <w:r>
-        <w:rPr>
-          <w:b/>
-        </w:rPr>
-        <w:t>Code, Name, Department, Designation, Gross, Status</w:t>
-      </w:r>
-      <w:r>
-        <w:t>.</w:t>
+        <w:t xml:space="preserve"> table: **Code, Name, Department, Designation, Joining date, Mobile,</w:t>
+      </w:r>
+    </w:p>
+    <w:p>
+      <w:r>
+        <w:t>Gross, Status**.</w:t>
+      </w:r>
+    </w:p>
+    <w:p>
+      <w:pPr>
+        <w:pStyle w:val="ListBullet"/>
+        <w:spacing w:after="40"/>
+      </w:pPr>
+      <w:r>
+        <w:rPr>
+          <w:b/>
+        </w:rPr>
+        <w:t>When someone leaves,</w:t>
+      </w:r>
+      <w:r>
+        <w:t xml:space="preserve"> select their row, switch </w:t>
+      </w:r>
+      <w:r>
+        <w:rPr>
+          <w:b/>
+        </w:rPr>
+        <w:t>Status</w:t>
+      </w:r>
+      <w:r>
+        <w:t xml:space="preserve"> to *Resigned* and</w:t>
+      </w:r>
+    </w:p>
+    <w:p>
+      <w:r>
+        <w:t xml:space="preserve">save. A </w:t>
+      </w:r>
+      <w:r>
+        <w:rPr>
+          <w:b/>
+        </w:rPr>
+        <w:t>Leaving date</w:t>
+      </w:r>
+      <w:r>
+        <w:t xml:space="preserve"> appears, defaulting to today. They stay on the list with their joining and leaving dates and keep every payslip they were paid; payroll simply stops including them. Nothing is deleted, and switching the status back to *Active* brings them back — which clears the leaving date, so re-employing somebody does not carry their old resignation with them.</w:t>
       </w:r>
     </w:p>
     <w:p>

</xml_diff>

<commit_message>
Fix the stretched tick box, and filter resigned staff
The global input rule gave every checkbox a full width, padding and a border, so
a tick box stretched across the form and its focus ring outlined the whole width —
reading as an empty text field with a tick floating inside. Tick boxes now take
the browser's own rendering, with the accent colour, and sit beside their label
(the `.inline-field` class stacks a label above its value, which is not what a
checkbox wants). The same fix covers the Settings and Data screens.

- Staff list gains a Leaving date column and a "Show active staff only" filter,
  and the card subtitle counts those who have resigned.
- The leaving date no longer sits under the status pill, now that it has a column.
- Manual updated.

Co-authored-by: CommandCodeBot <noreply@commandcode.ai>
</commit_message>
<xml_diff>
--- a/PRODUCTION_MANUAL.docx
+++ b/PRODUCTION_MANUAL.docx
@@ -7177,12 +7177,21 @@
         <w:t>Staff</w:t>
       </w:r>
       <w:r>
-        <w:t xml:space="preserve"> table: **Code, Name, Department, Designation, Joining date, Mobile,</w:t>
-      </w:r>
-    </w:p>
-    <w:p>
-      <w:r>
-        <w:t>Gross, Status**.</w:t>
+        <w:t xml:space="preserve"> table: **Code, Name, Department, Designation, Joining date, Leaving</w:t>
+      </w:r>
+    </w:p>
+    <w:p>
+      <w:r>
+        <w:t>date, Mobile, Gross, Status</w:t>
+      </w:r>
+      <w:r>
+        <w:rPr>
+          <w:b/>
+        </w:rPr>
+        <w:t xml:space="preserve">. </w:t>
+      </w:r>
+      <w:r>
+        <w:t>Show active staff only** hides those who have left; the card's subtitle counts them.</w:t>
       </w:r>
     </w:p>
     <w:p>

</xml_diff>

<commit_message>
Use the brand logo, and put the employee form behind a button
**Logo.** Two files are expected in `frontend/public`, taken from the brand kit:
`resinova-logo-light.svg` (the lockup with the charcoal wordmark, for the white
sign-in panel) and `resinova-logo-dark.svg` (the reverse lockup with the white
wordmark and the blue R, for the charcoal sidebar). Both are used where each is
drawn to be used — a reverse lockup exists precisely so a mark can sit on a dark
surface without a white box behind it.

The component falls back to the wordmark drawn in text when a file is absent, so
a missing file reads as a plain name rather than a broken image. Dropping the two
files in is the only step left.

**Employees.** The add/edit form was always on screen, pushing the staff list
down. It now opens from **Add employee** on the Staff card, or **Edit** on a row,
and closes with **Cancel** — the same shape as the item master.

Tests: 52 frontend.

Co-authored-by: CommandCodeBot <noreply@commandcode.ai>
</commit_message>
<xml_diff>
--- a/PRODUCTION_MANUAL.docx
+++ b/PRODUCTION_MANUAL.docx
@@ -7135,7 +7135,21 @@
         <w:t>Add an employee:</w:t>
       </w:r>
       <w:r>
-        <w:t xml:space="preserve"> </w:t>
+        <w:t xml:space="preserve"> press </w:t>
+      </w:r>
+      <w:r>
+        <w:rPr>
+          <w:b/>
+        </w:rPr>
+        <w:t>Add employee</w:t>
+      </w:r>
+      <w:r>
+        <w:t xml:space="preserve"> on the Staff card, which opens the</w:t>
+      </w:r>
+    </w:p>
+    <w:p>
+      <w:r>
+        <w:t xml:space="preserve">form: </w:t>
       </w:r>
       <w:r>
         <w:rPr>
@@ -7162,10 +7176,8 @@
         <w:t>Department</w:t>
       </w:r>
       <w:r>
-        <w:t xml:space="preserve"> (Office or Factory),</w:t>
-      </w:r>
-    </w:p>
-    <w:p>
+        <w:t xml:space="preserve"> (Office or Factory), </w:t>
+      </w:r>
       <w:r>
         <w:rPr>
           <w:b/>
@@ -7227,7 +7239,25 @@
         <w:t>Status</w:t>
       </w:r>
       <w:r>
-        <w:t>.</w:t>
+        <w:t xml:space="preserve">. The form stays closed until you ask for it, so the list is not pushed down the screen. </w:t>
+      </w:r>
+      <w:r>
+        <w:rPr>
+          <w:b/>
+        </w:rPr>
+        <w:t>Edit</w:t>
+      </w:r>
+      <w:r>
+        <w:t xml:space="preserve"> on a row — or a click anywhere on that row — opens the same form for that person, and </w:t>
+      </w:r>
+      <w:r>
+        <w:rPr>
+          <w:b/>
+        </w:rPr>
+        <w:t>Cancel</w:t>
+      </w:r>
+      <w:r>
+        <w:t xml:space="preserve"> closes it without saving.</w:t>
       </w:r>
     </w:p>
     <w:p>

</xml_diff>

<commit_message>
Complete the CSV exports across every list and report
Finishes what the previous commit started: Chart of Accounts, Journal Entries,
Inventory, Customers & Suppliers, Receipts & Payments, Purchase Entry, Production
Entry, Sales Entry, Employees, Payroll Runs, Trial Balance, General Ledger and
Balance Sheet all now export what they are showing.

**The Journal Entries export flattens to one row per line**, not per voucher —
every debit and credit with its voucher, account, segment and narration. That is
the general-ledger listing, and it is the first thing an external auditor asks
for.

Column headings are taken from each screen's own table rather than guessed from the
types, so a column cannot end up meaning something else. Two columns I had drafted
for the sales export — gross profit and margin — were dropped on checking: they are
not stored on a sale, they are computed for the preview, and inventing them in a
file would have been a quiet lie.
</commit_message>
<xml_diff>
--- a/PRODUCTION_MANUAL.docx
+++ b/PRODUCTION_MANUAL.docx
@@ -6882,7 +6882,27 @@
         <w:t>Where the button is:</w:t>
       </w:r>
       <w:r>
-        <w:t xml:space="preserve"> Trial Balance, General Ledger, Balance Sheet, Inventory, Customers &amp; Suppliers, and both the outstanding-invoice and receipts lists on Receipts &amp; Payments.</w:t>
+        <w:t xml:space="preserve"> every list and report — Chart of Accounts, Journal Entries, Inventory, Customers &amp; Suppliers, Receipts &amp; Payments (both the outstanding invoices and the payments list), Purchase Entry, Production Entry, Sales Entry, Employees, Payroll Runs, Trial Balance, General Ledger and Balance Sheet.</w:t>
+      </w:r>
+    </w:p>
+    <w:p>
+      <w:r>
+        <w:rPr>
+          <w:b/>
+        </w:rPr>
+        <w:t>The Journal Entries export is the one an auditor asks for.</w:t>
+      </w:r>
+      <w:r>
+        <w:t xml:space="preserve"> It writes </w:t>
+      </w:r>
+      <w:r>
+        <w:rPr>
+          <w:b/>
+        </w:rPr>
+        <w:t>one row per journal line</w:t>
+      </w:r>
+      <w:r>
+        <w:t>, not one per voucher, so a single file holds every debit and credit with its voucher, account, segment and narration — ready to sort and total in Excel. That is the general-ledger listing, and it is the file to hand over if the books are ever examined.</w:t>
       </w:r>
     </w:p>
     <w:p>

</xml_diff>

<commit_message>
Make data entry usable on a phone
Not a shrunken desktop layout — the warehouse floor, one hand on a phone and the
other on a delivery note. Three things, and everything here is one of them:

**One field per line.** The form grid fits three inputs across on a laptop, which
on a phone leaves each too narrow to read back what you typed. That is the
commonest way a quantity gets entered wrong, so below 700px every field gets its
own full-width line.

**Tap targets sized for a thumb** — 42px, and 15px text, because anything under
16px makes iOS zoom the whole page when a field is focused. Buttons inside a table
stay compact on purpose; making them thumb-sized would leave rows too tall to scan.

**Tables scroll sideways inside their card** with momentum on touch, and the page
itself no longer moves with them.

The menu already became a drawer at 900px, so this picks up from there.
</commit_message>
<xml_diff>
--- a/PRODUCTION_MANUAL.docx
+++ b/PRODUCTION_MANUAL.docx
@@ -6903,6 +6903,111 @@
       </w:r>
       <w:r>
         <w:t>, not one per voucher, so a single file holds every debit and credit with its voucher, account, segment and narration — ready to sort and total in Excel. That is the general-ledger listing, and it is the file to hand over if the books are ever examined.</w:t>
+      </w:r>
+    </w:p>
+    <w:p>
+      <w:pPr>
+        <w:pStyle w:val="Heading2"/>
+      </w:pPr>
+      <w:r>
+        <w:rPr>
+          <w:color w:val="0F172A"/>
+        </w:rPr>
+        <w:t>Using it on a phone</w:t>
+      </w:r>
+    </w:p>
+    <w:p>
+      <w:r>
+        <w:t>The system works on a phone for entering a purchase or a production run at the delivery point, and it changes shape deliberately rather than just shrinking:</w:t>
+      </w:r>
+    </w:p>
+    <w:p>
+      <w:pPr>
+        <w:pStyle w:val="ListBullet"/>
+        <w:spacing w:after="40"/>
+      </w:pPr>
+      <w:r>
+        <w:rPr>
+          <w:b/>
+        </w:rPr>
+        <w:t>The menu becomes a ☰ drawer</w:t>
+      </w:r>
+      <w:r>
+        <w:t>, opened from the top-left of any screen.</w:t>
+      </w:r>
+    </w:p>
+    <w:p>
+      <w:pPr>
+        <w:pStyle w:val="ListBullet"/>
+        <w:spacing w:after="40"/>
+      </w:pPr>
+      <w:r>
+        <w:rPr>
+          <w:b/>
+        </w:rPr>
+        <w:t>One field per line.</w:t>
+      </w:r>
+      <w:r>
+        <w:t xml:space="preserve"> On a laptop the fields sit two or three to a row; on a</w:t>
+      </w:r>
+    </w:p>
+    <w:p>
+      <w:r>
+        <w:t>phone each gets its own full-width line, because a field too narrow to read what you typed is how a quantity gets entered wrong.</w:t>
+      </w:r>
+    </w:p>
+    <w:p>
+      <w:pPr>
+        <w:pStyle w:val="ListBullet"/>
+        <w:spacing w:after="40"/>
+      </w:pPr>
+      <w:r>
+        <w:rPr>
+          <w:b/>
+        </w:rPr>
+        <w:t>Bigger buttons and inputs</w:t>
+      </w:r>
+      <w:r>
+        <w:t xml:space="preserve"> — sized for a thumb rather than a mouse. The small</w:t>
+      </w:r>
+    </w:p>
+    <w:p>
+      <w:r>
+        <w:t>action buttons inside a table stay compact on purpose, or the rows would become unusably tall.</w:t>
+      </w:r>
+    </w:p>
+    <w:p>
+      <w:pPr>
+        <w:pStyle w:val="ListBullet"/>
+        <w:spacing w:after="40"/>
+      </w:pPr>
+      <w:r>
+        <w:rPr>
+          <w:b/>
+        </w:rPr>
+        <w:t>Wide tables scroll sideways</w:t>
+      </w:r>
+      <w:r>
+        <w:t xml:space="preserve"> within their card, with the page itself staying</w:t>
+      </w:r>
+    </w:p>
+    <w:p>
+      <w:r>
+        <w:t>still, so the rest of the screen does not slide around while you look at a column.</w:t>
+      </w:r>
+    </w:p>
+    <w:p>
+      <w:r>
+        <w:t xml:space="preserve">Long lists and reports are easier to read on a laptop; the phone is for </w:t>
+      </w:r>
+      <w:r>
+        <w:rPr>
+          <w:b/>
+        </w:rPr>
+        <w:t>entering</w:t>
+      </w:r>
+      <w:r>
+        <w:t xml:space="preserve"> what happened while you are standing in front of it.</w:t>
       </w:r>
     </w:p>
     <w:p>

</xml_diff>

<commit_message>
Stack the purchase and production lists into cards on a phone
A ten-column table on a 360px screen is not readable however well it scrolls, so on
the two screens somebody actually uses on the warehouse floor the list becomes one
card per record, each figure labelled.

Opt-in by a `table-cards` class on the table, so the wide financial reports are
untouched: they keep their columns and scroll, which is right for a report being
studied rather than a list being read.

The column headings move into a `data-label` on each cell and the CSS prints them.
That is the only reason the markup carries those attributes — the header row is
hidden at this width, so without them the figures would be unlabelled numbers in a
box.

The first cell becomes the card's title rather than a field, and a cell with
nothing to label — the reverse action — shows its button alone.
</commit_message>
<xml_diff>
--- a/PRODUCTION_MANUAL.docx
+++ b/PRODUCTION_MANUAL.docx
@@ -7110,6 +7110,26 @@
     <w:p>
       <w:r>
         <w:t>still, so the rest of the screen does not slide around while you look at a column.</w:t>
+      </w:r>
+    </w:p>
+    <w:p>
+      <w:pPr>
+        <w:pStyle w:val="ListBullet"/>
+        <w:spacing w:after="40"/>
+      </w:pPr>
+      <w:r>
+        <w:rPr>
+          <w:b/>
+        </w:rPr>
+        <w:t>The purchase and production lists become cards</w:t>
+      </w:r>
+      <w:r>
+        <w:t xml:space="preserve"> on a phone: one record per</w:t>
+      </w:r>
+    </w:p>
+    <w:p>
+      <w:r>
+        <w:t>card, with each figure labelled — because a ten-column table on a 360px screen is not readable however well it scrolls. The wide reports keep their columns and scroll instead. The card layout is applied screen by screen, on the lists somebody reads on the floor rather than on a report being studied.</w:t>
       </w:r>
     </w:p>
     <w:p>

</xml_diff>

<commit_message>
Fill in the client's BIN and TIN
The two settings already existed and were sitting blank, marked "TBD (client)".
They now carry the real values and are marked confirmed:

    VAT registration (BIN)   002016027-0208
    TIN                      155979113247

These print on tax documents and are needed for the Mushak returns, so they belong
in Configuration rather than in the code — the client can correct a typo without a
developer, which is the same guarantee every other setting already has.

NOTE FOR THE LIVE DEPLOYMENT: this changes the value a *fresh* database starts
with, and nothing else. The boot-time seeding fills gaps and never overwrites a row
that already exists, so on the production database — where these two rows were
created blank on the first boot — they are still blank. Paste both into
Administration → Configuration → Company details and save. The go-live checklist
now says so, because a wrong BIN on an issued tax invoice is the sort of mistake
that is awkward to undo.
</commit_message>
<xml_diff>
--- a/PRODUCTION_MANUAL.docx
+++ b/PRODUCTION_MANUAL.docx
@@ -30116,12 +30116,30 @@
         <w:t>Confirm</w:t>
       </w:r>
       <w:r>
-        <w:t xml:space="preserve"> the name, address and</w:t>
-      </w:r>
-    </w:p>
-    <w:p>
-      <w:r>
-        <w:t>phone.</w:t>
+        <w:t xml:space="preserve"> the name, address,</w:t>
+      </w:r>
+    </w:p>
+    <w:p>
+      <w:r>
+        <w:t xml:space="preserve">phone, </w:t>
+      </w:r>
+      <w:r>
+        <w:rPr>
+          <w:b/>
+        </w:rPr>
+        <w:t>VAT registration (BIN)</w:t>
+      </w:r>
+      <w:r>
+        <w:t xml:space="preserve"> and </w:t>
+      </w:r>
+      <w:r>
+        <w:rPr>
+          <w:b/>
+        </w:rPr>
+        <w:t>TIN</w:t>
+      </w:r>
+      <w:r>
+        <w:t>. The BIN has to be right before any tax invoice is issued, because it is printed on the document.</w:t>
       </w:r>
     </w:p>
     <w:p>

</xml_diff>